<commit_message>
Add updated MNIST document and digit samples
</commit_message>
<xml_diff>
--- a/docs/2차시 MNIST 숫자 분류.docx
+++ b/docs/2차시 MNIST 숫자 분류.docx
@@ -2865,15 +2865,21 @@
         </w:rPr>
         <w:t xml:space="preserve">3.1 CNN이란 </w:t>
       </w:r>
-      <w:proofErr w:type="gramStart"/>
-      <w:r>
-        <w:rPr>
+      <w:r>
+        <w:rPr>
+          <w:rFonts w:hint="eastAsia"/>
           <w:b/>
           <w:bCs/>
         </w:rPr>
         <w:t>무엇인가</w:t>
       </w:r>
-      <w:proofErr w:type="gramEnd"/>
+      <w:r>
+        <w:rPr>
+          <w:b/>
+          <w:bCs/>
+        </w:rPr>
+        <w:t>?</w:t>
+      </w:r>
     </w:p>
     <w:p>
       <w:pPr>

</xml_diff>